<commit_message>
Read team composition from the register instead of guessing it
The Mode column labelled the Day 2 provider benchmark "Benchmark · teams". The
laboratory register says solo. I had copied the "Plenary · countries" shape from
the original document and filled in the team by assumption — in a document
already delivered for institutional use.

Team composition is a property of the specific laboratory, not of the mode, so it
is now read from labs[session['lab']]['team_en']. Three of the eleven hands-on
sessions were mislabelled by the hard-coded map.

Fixing it surfaced a second error the constant had hidden: "Assisting countries in
publishing their work" is a talk that links to a laboratory because it introduces
one, and appending the team gave "Talk · teams" — which says the audience listens
in pairs. Only lab and benchmark modes carry a team now.
</commit_message>
<xml_diff>
--- a/concept-note/STG17_Workshop_Agenda_Emerging_Issues_Emerging_Practice.docx
+++ b/concept-note/STG17_Workshop_Agenda_Emerging_Issues_Emerging_Practice.docx
@@ -2456,7 +2456,7 @@
                 <w:color w:val="33403A"/>
                 <w:sz w:val="16"/>
               </w:rPr>
-              <w:t>Laboratory</w:t>
+              <w:t>Laboratory · pairs</w:t>
             </w:r>
           </w:p>
         </w:tc>
@@ -2541,7 +2541,7 @@
                 <w:color w:val="33403A"/>
                 <w:sz w:val="16"/>
               </w:rPr>
-              <w:t>Laboratory</w:t>
+              <w:t>Laboratory · pairs</w:t>
             </w:r>
           </w:p>
         </w:tc>
@@ -2889,7 +2889,7 @@
                 <w:color w:val="33403A"/>
                 <w:sz w:val="16"/>
               </w:rPr>
-              <w:t>Laboratory</w:t>
+              <w:t>Laboratory · solo</w:t>
             </w:r>
           </w:p>
         </w:tc>
@@ -3182,7 +3182,7 @@
                 <w:color w:val="33403A"/>
                 <w:sz w:val="16"/>
               </w:rPr>
-              <w:t>Benchmark · teams</w:t>
+              <w:t>Benchmark · solo</w:t>
             </w:r>
           </w:p>
         </w:tc>
@@ -3267,7 +3267,7 @@
                 <w:color w:val="33403A"/>
                 <w:sz w:val="16"/>
               </w:rPr>
-              <w:t>Laboratory</w:t>
+              <w:t>Laboratory · stations</w:t>
             </w:r>
           </w:p>
         </w:tc>
@@ -3615,7 +3615,7 @@
                 <w:color w:val="33403A"/>
                 <w:sz w:val="16"/>
               </w:rPr>
-              <w:t>Laboratory</w:t>
+              <w:t>Laboratory · teams</w:t>
             </w:r>
           </w:p>
         </w:tc>
@@ -3908,7 +3908,7 @@
                 <w:color w:val="33403A"/>
                 <w:sz w:val="16"/>
               </w:rPr>
-              <w:t>Laboratory</w:t>
+              <w:t>Laboratory · teams</w:t>
             </w:r>
           </w:p>
         </w:tc>
@@ -3993,7 +3993,7 @@
                 <w:color w:val="33403A"/>
                 <w:sz w:val="16"/>
               </w:rPr>
-              <w:t>Laboratory</w:t>
+              <w:t>Laboratory · teams</w:t>
             </w:r>
           </w:p>
         </w:tc>
@@ -4429,7 +4429,7 @@
                 <w:color w:val="33403A"/>
                 <w:sz w:val="16"/>
               </w:rPr>
-              <w:t>Laboratory</w:t>
+              <w:t>Laboratory · teams</w:t>
             </w:r>
           </w:p>
         </w:tc>
@@ -4514,7 +4514,7 @@
                 <w:color w:val="33403A"/>
                 <w:sz w:val="16"/>
               </w:rPr>
-              <w:t>Laboratory</w:t>
+              <w:t>Laboratory · teams</w:t>
             </w:r>
           </w:p>
         </w:tc>
@@ -4719,7 +4719,7 @@
                 <w:color w:val="33403A"/>
                 <w:sz w:val="16"/>
               </w:rPr>
-              <w:t>Laboratory</w:t>
+              <w:t>Laboratory · teams</w:t>
             </w:r>
           </w:p>
         </w:tc>
@@ -4806,7 +4806,7 @@
                 <w:color w:val="33403A"/>
                 <w:sz w:val="16"/>
               </w:rPr>
-              <w:t>Laboratory</w:t>
+              <w:t>Laboratory · teams</w:t>
             </w:r>
           </w:p>
         </w:tc>

</xml_diff>